<commit_message>
Fix DOCX open failure and attach connectors via a drawing canvas (Phase 4b)
Root cause of the Word open error: wp:positionH relativeFrom=paragraph
is not a valid ST_RelFromH value (paragraph exists only in
ST_RelFromV). Word hard-fails on the invalid enum before its repair
path; lxml could not catch it (schema-level, not well-formedness).

Restructure: the whole diagram now lives in ONE wp:anchor containing a
single wpc:wpc drawing canvas. All shapes/connectors are wps:wsp
children in canvas-relative EMU coordinates; each shape has a stable
wps:cNvPr id and connectors attach via a:stCxn/a:endCxn (id + site idx),
so dragging a shape in Word drags its arrows. positionH uses column,
positionV paragraph (both schema-legal); page variant supported.

Back-edge keeps the exact 3-segment rail route. Tests pin the legal
ST_RelFromH/V value sets and lxml-parse every part of the generated
archive; 50 passing.

Co-Authored-By: Claude Fable 5 <noreply@anthropic.com>
</commit_message>
<xml_diff>
--- a/samples/output/flowchart_diagram.docx
+++ b/samples/output/flowchart_diagram.docx
@@ -5,1019 +5,648 @@
     <w:p xmlns:a="http://schemas.openxmlformats.org/drawingml/2006/main">
       <w:r>
         <w:drawing>
-          <wp:anchor distT="0" distB="0" distL="0" distR="0" simplePos="0" relativeHeight="251" behindDoc="0" locked="0" layoutInCell="1" allowOverlap="1">
+          <wp:anchor distT="0" distB="0" distL="0" distR="0" simplePos="0" relativeHeight="251658240" behindDoc="0" locked="0" layoutInCell="1" allowOverlap="1">
             <wp:simplePos x="0" y="0"/>
-            <wp:positionH relativeFrom="paragraph">
-              <wp:posOffset>2442575</wp:posOffset>
+            <wp:positionH relativeFrom="column">
+              <wp:posOffset>0</wp:posOffset>
             </wp:positionH>
             <wp:positionV relativeFrom="paragraph">
-              <wp:posOffset>488515</wp:posOffset>
+              <wp:posOffset>0</wp:posOffset>
             </wp:positionV>
-            <wp:extent cx="1139868" cy="407095"/>
+            <wp:extent cx="5943600" cy="6647447"/>
             <wp:effectExtent l="0" t="0" r="0" b="0"/>
             <wp:wrapNone/>
-            <wp:docPr id="1" name="node-n1"/>
+            <wp:docPr id="1" name="diagram-canvas"/>
             <wp:cNvGraphicFramePr/>
             <a:graphic>
-              <a:graphicData uri="http://schemas.microsoft.com/office/word/2010/wordprocessingShape">
-                <wps:wsp>
-                  <wps:cNvSpPr/>
-                  <wps:spPr>
-                    <a:xfrm>
-                      <a:off x="0" y="0"/>
-                      <a:ext cx="1139868" cy="407095"/>
-                    </a:xfrm>
-                    <a:prstGeom prst="roundRect">
-                      <a:avLst/>
-                    </a:prstGeom>
-                    <a:solidFill>
-                      <a:srgbClr val="FFFFFF"/>
-                    </a:solidFill>
-                    <a:ln w="19050">
+              <a:graphicData uri="http://schemas.microsoft.com/office/word/2010/wordprocessingCanvas">
+                <wpc:wpc>
+                  <wps:wsp>
+                    <wps:cNvPr id="2" name="node-n1"/>
+                    <wps:cNvSpPr/>
+                    <wps:spPr>
+                      <a:xfrm>
+                        <a:off x="2346157" y="469231"/>
+                        <a:ext cx="1094873" cy="391026"/>
+                      </a:xfrm>
+                      <a:prstGeom prst="roundRect">
+                        <a:avLst/>
+                      </a:prstGeom>
                       <a:solidFill>
-                        <a:srgbClr val="000000"/>
+                        <a:srgbClr val="FFFFFF"/>
                       </a:solidFill>
-                    </a:ln>
-                  </wps:spPr>
-                  <wps:txbx>
-                    <w:txbxContent>
-                      <w:p>
-                        <w:pPr>
-                          <w:spacing w:after="0"/>
-                          <w:jc w:val="center"/>
-                        </w:pPr>
-                        <w:r>
-                          <w:rPr>
-                            <w:sz w:val="20"/>
-                            <w:szCs w:val="20"/>
-                          </w:rPr>
-                          <w:t xml:space="preserve">Başlanğıc</w:t>
-                        </w:r>
-                      </w:p>
-                    </w:txbxContent>
-                  </wps:txbx>
-                  <wps:bodyPr rot="0" vert="horz" lIns="18000" tIns="18000" rIns="18000" bIns="18000" anchor="ctr" anchorCtr="0">
-                    <a:noAutofit/>
-                  </wps:bodyPr>
-                </wps:wsp>
-              </a:graphicData>
-            </a:graphic>
-          </wp:anchor>
-        </w:drawing>
-      </w:r>
-      <w:r>
-        <w:drawing>
-          <wp:anchor distT="0" distB="0" distL="0" distR="0" simplePos="0" relativeHeight="252" behindDoc="0" locked="0" layoutInCell="1" allowOverlap="1">
-            <wp:simplePos x="0" y="0"/>
-            <wp:positionH relativeFrom="paragraph">
-              <wp:posOffset>2361156</wp:posOffset>
-            </wp:positionH>
-            <wp:positionV relativeFrom="paragraph">
-              <wp:posOffset>1628383</wp:posOffset>
-            </wp:positionV>
-            <wp:extent cx="1302706" cy="407095"/>
-            <wp:effectExtent l="0" t="0" r="0" b="0"/>
-            <wp:wrapNone/>
-            <wp:docPr id="2" name="node-n2"/>
-            <wp:cNvGraphicFramePr/>
-            <a:graphic>
-              <a:graphicData uri="http://schemas.microsoft.com/office/word/2010/wordprocessingShape">
-                <wps:wsp>
-                  <wps:cNvSpPr/>
-                  <wps:spPr>
-                    <a:xfrm>
-                      <a:off x="0" y="0"/>
-                      <a:ext cx="1302706" cy="407095"/>
-                    </a:xfrm>
-                    <a:prstGeom prst="parallelogram">
-                      <a:avLst/>
-                    </a:prstGeom>
-                    <a:solidFill>
-                      <a:srgbClr val="FFFFFF"/>
-                    </a:solidFill>
-                    <a:ln w="19050">
+                      <a:ln w="19050">
+                        <a:solidFill>
+                          <a:srgbClr val="000000"/>
+                        </a:solidFill>
+                      </a:ln>
+                    </wps:spPr>
+                    <wps:txbx>
+                      <w:txbxContent>
+                        <w:p>
+                          <w:pPr>
+                            <w:spacing w:after="0"/>
+                            <w:jc w:val="center"/>
+                          </w:pPr>
+                          <w:r>
+                            <w:rPr>
+                              <w:sz w:val="18"/>
+                              <w:szCs w:val="18"/>
+                            </w:rPr>
+                            <w:t xml:space="preserve">Başlanğıc</w:t>
+                          </w:r>
+                        </w:p>
+                      </w:txbxContent>
+                    </wps:txbx>
+                    <wps:bodyPr rot="0" vert="horz" lIns="18000" tIns="18000" rIns="18000" bIns="18000" anchor="ctr" anchorCtr="0">
+                      <a:noAutofit/>
+                    </wps:bodyPr>
+                  </wps:wsp>
+                  <wps:wsp>
+                    <wps:cNvPr id="3" name="node-n2"/>
+                    <wps:cNvSpPr/>
+                    <wps:spPr>
+                      <a:xfrm>
+                        <a:off x="2267952" y="1564105"/>
+                        <a:ext cx="1251284" cy="391026"/>
+                      </a:xfrm>
+                      <a:prstGeom prst="parallelogram">
+                        <a:avLst/>
+                      </a:prstGeom>
                       <a:solidFill>
-                        <a:srgbClr val="000000"/>
+                        <a:srgbClr val="FFFFFF"/>
                       </a:solidFill>
-                    </a:ln>
-                  </wps:spPr>
-                  <wps:txbx>
-                    <w:txbxContent>
-                      <w:p>
-                        <w:pPr>
-                          <w:spacing w:after="0"/>
-                          <w:jc w:val="center"/>
-                        </w:pPr>
-                        <w:r>
-                          <w:rPr>
-                            <w:sz w:val="20"/>
-                            <w:szCs w:val="20"/>
-                          </w:rPr>
-                          <w:t xml:space="preserve">n</w:t>
-                        </w:r>
-                      </w:p>
-                    </w:txbxContent>
-                  </wps:txbx>
-                  <wps:bodyPr rot="0" vert="horz" lIns="18000" tIns="18000" rIns="18000" bIns="18000" anchor="ctr" anchorCtr="0">
-                    <a:noAutofit/>
-                  </wps:bodyPr>
-                </wps:wsp>
-              </a:graphicData>
-            </a:graphic>
-          </wp:anchor>
-        </w:drawing>
-      </w:r>
-      <w:r>
-        <w:drawing>
-          <wp:anchor distT="0" distB="0" distL="0" distR="0" simplePos="0" relativeHeight="253" behindDoc="0" locked="0" layoutInCell="1" allowOverlap="1">
-            <wp:simplePos x="0" y="0"/>
-            <wp:positionH relativeFrom="paragraph">
-              <wp:posOffset>2361156</wp:posOffset>
-            </wp:positionH>
-            <wp:positionV relativeFrom="paragraph">
-              <wp:posOffset>2768252</wp:posOffset>
-            </wp:positionV>
-            <wp:extent cx="1302706" cy="407095"/>
-            <wp:effectExtent l="0" t="0" r="0" b="0"/>
-            <wp:wrapNone/>
-            <wp:docPr id="3" name="node-n3"/>
-            <wp:cNvGraphicFramePr/>
-            <a:graphic>
-              <a:graphicData uri="http://schemas.microsoft.com/office/word/2010/wordprocessingShape">
-                <wps:wsp>
-                  <wps:cNvSpPr/>
-                  <wps:spPr>
-                    <a:xfrm>
-                      <a:off x="0" y="0"/>
-                      <a:ext cx="1302706" cy="407095"/>
-                    </a:xfrm>
-                    <a:prstGeom prst="rect">
-                      <a:avLst/>
-                    </a:prstGeom>
-                    <a:solidFill>
-                      <a:srgbClr val="FFFFFF"/>
-                    </a:solidFill>
-                    <a:ln w="19050">
+                      <a:ln w="19050">
+                        <a:solidFill>
+                          <a:srgbClr val="000000"/>
+                        </a:solidFill>
+                      </a:ln>
+                    </wps:spPr>
+                    <wps:txbx>
+                      <w:txbxContent>
+                        <w:p>
+                          <w:pPr>
+                            <w:spacing w:after="0"/>
+                            <w:jc w:val="center"/>
+                          </w:pPr>
+                          <w:r>
+                            <w:rPr>
+                              <w:sz w:val="18"/>
+                              <w:szCs w:val="18"/>
+                            </w:rPr>
+                            <w:t xml:space="preserve">n</w:t>
+                          </w:r>
+                        </w:p>
+                      </w:txbxContent>
+                    </wps:txbx>
+                    <wps:bodyPr rot="0" vert="horz" lIns="18000" tIns="18000" rIns="18000" bIns="18000" anchor="ctr" anchorCtr="0">
+                      <a:noAutofit/>
+                    </wps:bodyPr>
+                  </wps:wsp>
+                  <wps:wsp>
+                    <wps:cNvPr id="4" name="node-n3"/>
+                    <wps:cNvSpPr/>
+                    <wps:spPr>
+                      <a:xfrm>
+                        <a:off x="2267952" y="2658978"/>
+                        <a:ext cx="1251284" cy="391026"/>
+                      </a:xfrm>
+                      <a:prstGeom prst="rect">
+                        <a:avLst/>
+                      </a:prstGeom>
                       <a:solidFill>
-                        <a:srgbClr val="000000"/>
+                        <a:srgbClr val="FFFFFF"/>
                       </a:solidFill>
-                    </a:ln>
-                  </wps:spPr>
-                  <wps:txbx>
-                    <w:txbxContent>
-                      <w:p>
-                        <w:pPr>
-                          <w:spacing w:after="0"/>
-                          <w:jc w:val="center"/>
-                        </w:pPr>
-                        <w:r>
-                          <w:rPr>
-                            <w:sz w:val="20"/>
-                            <w:szCs w:val="20"/>
-                          </w:rPr>
-                          <w:t xml:space="preserve">a = 3</w:t>
-                        </w:r>
-                      </w:p>
-                    </w:txbxContent>
-                  </wps:txbx>
-                  <wps:bodyPr rot="0" vert="horz" lIns="18000" tIns="18000" rIns="18000" bIns="18000" anchor="ctr" anchorCtr="0">
-                    <a:noAutofit/>
-                  </wps:bodyPr>
-                </wps:wsp>
-              </a:graphicData>
-            </a:graphic>
-          </wp:anchor>
-        </w:drawing>
-      </w:r>
-      <w:r>
-        <w:drawing>
-          <wp:anchor distT="0" distB="0" distL="0" distR="0" simplePos="0" relativeHeight="254" behindDoc="0" locked="0" layoutInCell="1" allowOverlap="1">
-            <wp:simplePos x="0" y="0"/>
-            <wp:positionH relativeFrom="paragraph">
-              <wp:posOffset>2279736</wp:posOffset>
-            </wp:positionH>
-            <wp:positionV relativeFrom="paragraph">
-              <wp:posOffset>3745282</wp:posOffset>
-            </wp:positionV>
-            <wp:extent cx="1465545" cy="732772"/>
-            <wp:effectExtent l="0" t="0" r="0" b="0"/>
-            <wp:wrapNone/>
-            <wp:docPr id="4" name="node-n4"/>
-            <wp:cNvGraphicFramePr/>
-            <a:graphic>
-              <a:graphicData uri="http://schemas.microsoft.com/office/word/2010/wordprocessingShape">
-                <wps:wsp>
-                  <wps:cNvSpPr/>
-                  <wps:spPr>
-                    <a:xfrm>
-                      <a:off x="0" y="0"/>
-                      <a:ext cx="1465545" cy="732772"/>
-                    </a:xfrm>
-                    <a:prstGeom prst="diamond">
-                      <a:avLst/>
-                    </a:prstGeom>
-                    <a:solidFill>
-                      <a:srgbClr val="FFFFFF"/>
-                    </a:solidFill>
-                    <a:ln w="19050">
+                      <a:ln w="19050">
+                        <a:solidFill>
+                          <a:srgbClr val="000000"/>
+                        </a:solidFill>
+                      </a:ln>
+                    </wps:spPr>
+                    <wps:txbx>
+                      <w:txbxContent>
+                        <w:p>
+                          <w:pPr>
+                            <w:spacing w:after="0"/>
+                            <w:jc w:val="center"/>
+                          </w:pPr>
+                          <w:r>
+                            <w:rPr>
+                              <w:sz w:val="18"/>
+                              <w:szCs w:val="18"/>
+                            </w:rPr>
+                            <w:t xml:space="preserve">a = 3</w:t>
+                          </w:r>
+                        </w:p>
+                      </w:txbxContent>
+                    </wps:txbx>
+                    <wps:bodyPr rot="0" vert="horz" lIns="18000" tIns="18000" rIns="18000" bIns="18000" anchor="ctr" anchorCtr="0">
+                      <a:noAutofit/>
+                    </wps:bodyPr>
+                  </wps:wsp>
+                  <wps:wsp>
+                    <wps:cNvPr id="5" name="node-n4"/>
+                    <wps:cNvSpPr/>
+                    <wps:spPr>
+                      <a:xfrm>
+                        <a:off x="2189747" y="3597442"/>
+                        <a:ext cx="1407694" cy="703847"/>
+                      </a:xfrm>
+                      <a:prstGeom prst="diamond">
+                        <a:avLst/>
+                      </a:prstGeom>
                       <a:solidFill>
-                        <a:srgbClr val="000000"/>
+                        <a:srgbClr val="FFFFFF"/>
                       </a:solidFill>
-                    </a:ln>
-                  </wps:spPr>
-                  <wps:txbx>
-                    <w:txbxContent>
-                      <w:p>
-                        <w:pPr>
-                          <w:spacing w:after="0"/>
-                          <w:jc w:val="center"/>
-                        </w:pPr>
-                        <w:r>
-                          <w:rPr>
-                            <w:sz w:val="20"/>
-                            <w:szCs w:val="20"/>
-                          </w:rPr>
-                          <w:t xml:space="preserve">a &lt; 164</w:t>
-                        </w:r>
-                      </w:p>
-                    </w:txbxContent>
-                  </wps:txbx>
-                  <wps:bodyPr rot="0" vert="horz" lIns="18000" tIns="18000" rIns="18000" bIns="18000" anchor="ctr" anchorCtr="0">
-                    <a:noAutofit/>
-                  </wps:bodyPr>
-                </wps:wsp>
-              </a:graphicData>
-            </a:graphic>
-          </wp:anchor>
-        </w:drawing>
-      </w:r>
-      <w:r>
-        <w:drawing>
-          <wp:anchor distT="0" distB="0" distL="0" distR="0" simplePos="0" relativeHeight="255" behindDoc="0" locked="0" layoutInCell="1" allowOverlap="1">
-            <wp:simplePos x="0" y="0"/>
-            <wp:positionH relativeFrom="paragraph">
-              <wp:posOffset>407095</wp:posOffset>
-            </wp:positionH>
-            <wp:positionV relativeFrom="paragraph">
-              <wp:posOffset>5047989</wp:posOffset>
-            </wp:positionV>
-            <wp:extent cx="1302706" cy="407095"/>
-            <wp:effectExtent l="0" t="0" r="0" b="0"/>
-            <wp:wrapNone/>
-            <wp:docPr id="5" name="node-n5"/>
-            <wp:cNvGraphicFramePr/>
-            <a:graphic>
-              <a:graphicData uri="http://schemas.microsoft.com/office/word/2010/wordprocessingShape">
-                <wps:wsp>
-                  <wps:cNvSpPr/>
-                  <wps:spPr>
-                    <a:xfrm>
-                      <a:off x="0" y="0"/>
-                      <a:ext cx="1302706" cy="407095"/>
-                    </a:xfrm>
-                    <a:prstGeom prst="parallelogram">
-                      <a:avLst/>
-                    </a:prstGeom>
-                    <a:solidFill>
-                      <a:srgbClr val="FFFFFF"/>
-                    </a:solidFill>
-                    <a:ln w="19050">
+                      <a:ln w="19050">
+                        <a:solidFill>
+                          <a:srgbClr val="000000"/>
+                        </a:solidFill>
+                      </a:ln>
+                    </wps:spPr>
+                    <wps:txbx>
+                      <w:txbxContent>
+                        <w:p>
+                          <w:pPr>
+                            <w:spacing w:after="0"/>
+                            <w:jc w:val="center"/>
+                          </w:pPr>
+                          <w:r>
+                            <w:rPr>
+                              <w:sz w:val="18"/>
+                              <w:szCs w:val="18"/>
+                            </w:rPr>
+                            <w:t xml:space="preserve">a &lt; 164</w:t>
+                          </w:r>
+                        </w:p>
+                      </w:txbxContent>
+                    </wps:txbx>
+                    <wps:bodyPr rot="0" vert="horz" lIns="18000" tIns="18000" rIns="18000" bIns="18000" anchor="ctr" anchorCtr="0">
+                      <a:noAutofit/>
+                    </wps:bodyPr>
+                  </wps:wsp>
+                  <wps:wsp>
+                    <wps:cNvPr id="6" name="node-n5"/>
+                    <wps:cNvSpPr/>
+                    <wps:spPr>
+                      <a:xfrm>
+                        <a:off x="391026" y="4848726"/>
+                        <a:ext cx="1251284" cy="391026"/>
+                      </a:xfrm>
+                      <a:prstGeom prst="parallelogram">
+                        <a:avLst/>
+                      </a:prstGeom>
                       <a:solidFill>
-                        <a:srgbClr val="000000"/>
+                        <a:srgbClr val="FFFFFF"/>
                       </a:solidFill>
-                    </a:ln>
-                  </wps:spPr>
-                  <wps:txbx>
-                    <w:txbxContent>
-                      <w:p>
-                        <w:pPr>
-                          <w:spacing w:after="0"/>
-                          <w:jc w:val="center"/>
-                        </w:pPr>
-                        <w:r>
-                          <w:rPr>
-                            <w:sz w:val="20"/>
-                            <w:szCs w:val="20"/>
-                          </w:rPr>
-                          <w:t xml:space="preserve">n</w:t>
-                        </w:r>
-                      </w:p>
-                    </w:txbxContent>
-                  </wps:txbx>
-                  <wps:bodyPr rot="0" vert="horz" lIns="18000" tIns="18000" rIns="18000" bIns="18000" anchor="ctr" anchorCtr="0">
-                    <a:noAutofit/>
-                  </wps:bodyPr>
-                </wps:wsp>
-              </a:graphicData>
-            </a:graphic>
-          </wp:anchor>
-        </w:drawing>
-      </w:r>
-      <w:r>
-        <w:drawing>
-          <wp:anchor distT="0" distB="0" distL="0" distR="0" simplePos="0" relativeHeight="256" behindDoc="0" locked="0" layoutInCell="1" allowOverlap="1">
-            <wp:simplePos x="0" y="0"/>
-            <wp:positionH relativeFrom="paragraph">
-              <wp:posOffset>488515</wp:posOffset>
-            </wp:positionH>
-            <wp:positionV relativeFrom="paragraph">
-              <wp:posOffset>6187857</wp:posOffset>
-            </wp:positionV>
-            <wp:extent cx="1139868" cy="407095"/>
-            <wp:effectExtent l="0" t="0" r="0" b="0"/>
-            <wp:wrapNone/>
-            <wp:docPr id="6" name="node-n6"/>
-            <wp:cNvGraphicFramePr/>
-            <a:graphic>
-              <a:graphicData uri="http://schemas.microsoft.com/office/word/2010/wordprocessingShape">
-                <wps:wsp>
-                  <wps:cNvSpPr/>
-                  <wps:spPr>
-                    <a:xfrm>
-                      <a:off x="0" y="0"/>
-                      <a:ext cx="1139868" cy="407095"/>
-                    </a:xfrm>
-                    <a:prstGeom prst="roundRect">
-                      <a:avLst/>
-                    </a:prstGeom>
-                    <a:solidFill>
-                      <a:srgbClr val="FFFFFF"/>
-                    </a:solidFill>
-                    <a:ln w="19050">
+                      <a:ln w="19050">
+                        <a:solidFill>
+                          <a:srgbClr val="000000"/>
+                        </a:solidFill>
+                      </a:ln>
+                    </wps:spPr>
+                    <wps:txbx>
+                      <w:txbxContent>
+                        <w:p>
+                          <w:pPr>
+                            <w:spacing w:after="0"/>
+                            <w:jc w:val="center"/>
+                          </w:pPr>
+                          <w:r>
+                            <w:rPr>
+                              <w:sz w:val="18"/>
+                              <w:szCs w:val="18"/>
+                            </w:rPr>
+                            <w:t xml:space="preserve">n</w:t>
+                          </w:r>
+                        </w:p>
+                      </w:txbxContent>
+                    </wps:txbx>
+                    <wps:bodyPr rot="0" vert="horz" lIns="18000" tIns="18000" rIns="18000" bIns="18000" anchor="ctr" anchorCtr="0">
+                      <a:noAutofit/>
+                    </wps:bodyPr>
+                  </wps:wsp>
+                  <wps:wsp>
+                    <wps:cNvPr id="7" name="node-n6"/>
+                    <wps:cNvSpPr/>
+                    <wps:spPr>
+                      <a:xfrm>
+                        <a:off x="469231" y="5943600"/>
+                        <a:ext cx="1094873" cy="391026"/>
+                      </a:xfrm>
+                      <a:prstGeom prst="roundRect">
+                        <a:avLst/>
+                      </a:prstGeom>
                       <a:solidFill>
-                        <a:srgbClr val="000000"/>
+                        <a:srgbClr val="FFFFFF"/>
                       </a:solidFill>
-                    </a:ln>
-                  </wps:spPr>
-                  <wps:txbx>
-                    <w:txbxContent>
-                      <w:p>
-                        <w:pPr>
-                          <w:spacing w:after="0"/>
-                          <w:jc w:val="center"/>
-                        </w:pPr>
-                        <w:r>
-                          <w:rPr>
-                            <w:sz w:val="20"/>
-                            <w:szCs w:val="20"/>
-                          </w:rPr>
-                          <w:t xml:space="preserve">Son</w:t>
-                        </w:r>
-                      </w:p>
-                    </w:txbxContent>
-                  </wps:txbx>
-                  <wps:bodyPr rot="0" vert="horz" lIns="18000" tIns="18000" rIns="18000" bIns="18000" anchor="ctr" anchorCtr="0">
-                    <a:noAutofit/>
-                  </wps:bodyPr>
-                </wps:wsp>
-              </a:graphicData>
-            </a:graphic>
-          </wp:anchor>
-        </w:drawing>
-      </w:r>
-      <w:r>
-        <w:drawing>
-          <wp:anchor distT="0" distB="0" distL="0" distR="0" simplePos="0" relativeHeight="257" behindDoc="0" locked="0" layoutInCell="1" allowOverlap="1">
-            <wp:simplePos x="0" y="0"/>
-            <wp:positionH relativeFrom="paragraph">
-              <wp:posOffset>4315216</wp:posOffset>
-            </wp:positionH>
-            <wp:positionV relativeFrom="paragraph">
-              <wp:posOffset>5047989</wp:posOffset>
-            </wp:positionV>
-            <wp:extent cx="1302706" cy="407095"/>
-            <wp:effectExtent l="0" t="0" r="0" b="0"/>
-            <wp:wrapNone/>
-            <wp:docPr id="7" name="node-n7"/>
-            <wp:cNvGraphicFramePr/>
-            <a:graphic>
-              <a:graphicData uri="http://schemas.microsoft.com/office/word/2010/wordprocessingShape">
-                <wps:wsp>
-                  <wps:cNvSpPr/>
-                  <wps:spPr>
-                    <a:xfrm>
-                      <a:off x="0" y="0"/>
-                      <a:ext cx="1302706" cy="407095"/>
-                    </a:xfrm>
-                    <a:prstGeom prst="rect">
-                      <a:avLst/>
-                    </a:prstGeom>
-                    <a:solidFill>
-                      <a:srgbClr val="FFFFFF"/>
-                    </a:solidFill>
-                    <a:ln w="19050">
+                      <a:ln w="19050">
+                        <a:solidFill>
+                          <a:srgbClr val="000000"/>
+                        </a:solidFill>
+                      </a:ln>
+                    </wps:spPr>
+                    <wps:txbx>
+                      <w:txbxContent>
+                        <w:p>
+                          <w:pPr>
+                            <w:spacing w:after="0"/>
+                            <w:jc w:val="center"/>
+                          </w:pPr>
+                          <w:r>
+                            <w:rPr>
+                              <w:sz w:val="18"/>
+                              <w:szCs w:val="18"/>
+                            </w:rPr>
+                            <w:t xml:space="preserve">Son</w:t>
+                          </w:r>
+                        </w:p>
+                      </w:txbxContent>
+                    </wps:txbx>
+                    <wps:bodyPr rot="0" vert="horz" lIns="18000" tIns="18000" rIns="18000" bIns="18000" anchor="ctr" anchorCtr="0">
+                      <a:noAutofit/>
+                    </wps:bodyPr>
+                  </wps:wsp>
+                  <wps:wsp>
+                    <wps:cNvPr id="8" name="node-n7"/>
+                    <wps:cNvSpPr/>
+                    <wps:spPr>
+                      <a:xfrm>
+                        <a:off x="4144878" y="4848726"/>
+                        <a:ext cx="1251284" cy="391026"/>
+                      </a:xfrm>
+                      <a:prstGeom prst="rect">
+                        <a:avLst/>
+                      </a:prstGeom>
                       <a:solidFill>
-                        <a:srgbClr val="000000"/>
+                        <a:srgbClr val="FFFFFF"/>
                       </a:solidFill>
-                    </a:ln>
-                  </wps:spPr>
-                  <wps:txbx>
-                    <w:txbxContent>
-                      <w:p>
-                        <w:pPr>
-                          <w:spacing w:after="0"/>
-                          <w:jc w:val="center"/>
-                        </w:pPr>
-                        <w:r>
-                          <w:rPr>
-                            <w:sz w:val="20"/>
-                            <w:szCs w:val="20"/>
-                          </w:rPr>
-                          <w:t xml:space="preserve">n = n - 8</w:t>
-                        </w:r>
-                      </w:p>
-                    </w:txbxContent>
-                  </wps:txbx>
-                  <wps:bodyPr rot="0" vert="horz" lIns="18000" tIns="18000" rIns="18000" bIns="18000" anchor="ctr" anchorCtr="0">
-                    <a:noAutofit/>
-                  </wps:bodyPr>
-                </wps:wsp>
-              </a:graphicData>
-            </a:graphic>
-          </wp:anchor>
-        </w:drawing>
-      </w:r>
-      <w:r>
-        <w:drawing>
-          <wp:anchor distT="0" distB="0" distL="0" distR="0" simplePos="0" relativeHeight="258" behindDoc="0" locked="0" layoutInCell="1" allowOverlap="1">
-            <wp:simplePos x="0" y="0"/>
-            <wp:positionH relativeFrom="paragraph">
-              <wp:posOffset>4315216</wp:posOffset>
-            </wp:positionH>
-            <wp:positionV relativeFrom="paragraph">
-              <wp:posOffset>6187857</wp:posOffset>
-            </wp:positionV>
-            <wp:extent cx="1302706" cy="407095"/>
-            <wp:effectExtent l="0" t="0" r="0" b="0"/>
-            <wp:wrapNone/>
-            <wp:docPr id="8" name="node-n8"/>
-            <wp:cNvGraphicFramePr/>
-            <a:graphic>
-              <a:graphicData uri="http://schemas.microsoft.com/office/word/2010/wordprocessingShape">
-                <wps:wsp>
-                  <wps:cNvSpPr/>
-                  <wps:spPr>
-                    <a:xfrm>
-                      <a:off x="0" y="0"/>
-                      <a:ext cx="1302706" cy="407095"/>
-                    </a:xfrm>
-                    <a:prstGeom prst="rect">
-                      <a:avLst/>
-                    </a:prstGeom>
-                    <a:solidFill>
-                      <a:srgbClr val="FFFFFF"/>
-                    </a:solidFill>
-                    <a:ln w="19050">
+                      <a:ln w="19050">
+                        <a:solidFill>
+                          <a:srgbClr val="000000"/>
+                        </a:solidFill>
+                      </a:ln>
+                    </wps:spPr>
+                    <wps:txbx>
+                      <w:txbxContent>
+                        <w:p>
+                          <w:pPr>
+                            <w:spacing w:after="0"/>
+                            <w:jc w:val="center"/>
+                          </w:pPr>
+                          <w:r>
+                            <w:rPr>
+                              <w:sz w:val="18"/>
+                              <w:szCs w:val="18"/>
+                            </w:rPr>
+                            <w:t xml:space="preserve">n = n - 8</w:t>
+                          </w:r>
+                        </w:p>
+                      </w:txbxContent>
+                    </wps:txbx>
+                    <wps:bodyPr rot="0" vert="horz" lIns="18000" tIns="18000" rIns="18000" bIns="18000" anchor="ctr" anchorCtr="0">
+                      <a:noAutofit/>
+                    </wps:bodyPr>
+                  </wps:wsp>
+                  <wps:wsp>
+                    <wps:cNvPr id="9" name="node-n8"/>
+                    <wps:cNvSpPr/>
+                    <wps:spPr>
+                      <a:xfrm>
+                        <a:off x="4144878" y="5943600"/>
+                        <a:ext cx="1251284" cy="391026"/>
+                      </a:xfrm>
+                      <a:prstGeom prst="rect">
+                        <a:avLst/>
+                      </a:prstGeom>
                       <a:solidFill>
-                        <a:srgbClr val="000000"/>
+                        <a:srgbClr val="FFFFFF"/>
                       </a:solidFill>
-                    </a:ln>
-                  </wps:spPr>
-                  <wps:txbx>
-                    <w:txbxContent>
-                      <w:p>
-                        <w:pPr>
-                          <w:spacing w:after="0"/>
-                          <w:jc w:val="center"/>
-                        </w:pPr>
-                        <w:r>
-                          <w:rPr>
-                            <w:sz w:val="20"/>
-                            <w:szCs w:val="20"/>
-                          </w:rPr>
-                          <w:t xml:space="preserve">a = a + 16</w:t>
-                        </w:r>
-                      </w:p>
-                    </w:txbxContent>
-                  </wps:txbx>
-                  <wps:bodyPr rot="0" vert="horz" lIns="18000" tIns="18000" rIns="18000" bIns="18000" anchor="ctr" anchorCtr="0">
-                    <a:noAutofit/>
-                  </wps:bodyPr>
-                </wps:wsp>
-              </a:graphicData>
-            </a:graphic>
-          </wp:anchor>
-        </w:drawing>
-      </w:r>
-      <w:r>
-        <w:drawing>
-          <wp:anchor distT="0" distB="0" distL="0" distR="0" simplePos="0" relativeHeight="259" behindDoc="0" locked="0" layoutInCell="1" allowOverlap="1">
-            <wp:simplePos x="0" y="0"/>
-            <wp:positionH relativeFrom="paragraph">
-              <wp:posOffset>3012509</wp:posOffset>
-            </wp:positionH>
-            <wp:positionV relativeFrom="paragraph">
-              <wp:posOffset>895610</wp:posOffset>
-            </wp:positionV>
-            <wp:extent cx="1" cy="732772"/>
-            <wp:effectExtent l="0" t="0" r="0" b="0"/>
-            <wp:wrapNone/>
-            <wp:docPr id="9" name="edge-n1-n2"/>
-            <wp:cNvGraphicFramePr/>
-            <a:graphic>
-              <a:graphicData uri="http://schemas.microsoft.com/office/word/2010/wordprocessingShape">
-                <wps:wsp>
-                  <wps:cNvCnPr/>
-                  <wps:spPr>
-                    <a:xfrm>
-                      <a:off x="0" y="0"/>
-                      <a:ext cx="1" cy="732772"/>
-                    </a:xfrm>
-                    <a:prstGeom prst="line">
-                      <a:avLst/>
-                    </a:prstGeom>
-                    <a:ln w="19050">
-                      <a:solidFill>
-                        <a:srgbClr val="000000"/>
-                      </a:solidFill>
-                      <a:tailEnd type="triangle"/>
-                    </a:ln>
-                  </wps:spPr>
-                  <wps:bodyPr/>
-                </wps:wsp>
-              </a:graphicData>
-            </a:graphic>
-          </wp:anchor>
-        </w:drawing>
-      </w:r>
-      <w:r>
-        <w:drawing>
-          <wp:anchor distT="0" distB="0" distL="0" distR="0" simplePos="0" relativeHeight="260" behindDoc="0" locked="0" layoutInCell="1" allowOverlap="1">
-            <wp:simplePos x="0" y="0"/>
-            <wp:positionH relativeFrom="paragraph">
-              <wp:posOffset>3012509</wp:posOffset>
-            </wp:positionH>
-            <wp:positionV relativeFrom="paragraph">
-              <wp:posOffset>2035479</wp:posOffset>
-            </wp:positionV>
-            <wp:extent cx="1" cy="732772"/>
-            <wp:effectExtent l="0" t="0" r="0" b="0"/>
-            <wp:wrapNone/>
-            <wp:docPr id="10" name="edge-n2-n3"/>
-            <wp:cNvGraphicFramePr/>
-            <a:graphic>
-              <a:graphicData uri="http://schemas.microsoft.com/office/word/2010/wordprocessingShape">
-                <wps:wsp>
-                  <wps:cNvCnPr/>
-                  <wps:spPr>
-                    <a:xfrm>
-                      <a:off x="0" y="0"/>
-                      <a:ext cx="1" cy="732772"/>
-                    </a:xfrm>
-                    <a:prstGeom prst="line">
-                      <a:avLst/>
-                    </a:prstGeom>
-                    <a:ln w="19050">
-                      <a:solidFill>
-                        <a:srgbClr val="000000"/>
-                      </a:solidFill>
-                      <a:tailEnd type="triangle"/>
-                    </a:ln>
-                  </wps:spPr>
-                  <wps:bodyPr/>
-                </wps:wsp>
-              </a:graphicData>
-            </a:graphic>
-          </wp:anchor>
-        </w:drawing>
-      </w:r>
-      <w:r>
-        <w:drawing>
-          <wp:anchor distT="0" distB="0" distL="0" distR="0" simplePos="0" relativeHeight="261" behindDoc="0" locked="0" layoutInCell="1" allowOverlap="1">
-            <wp:simplePos x="0" y="0"/>
-            <wp:positionH relativeFrom="paragraph">
-              <wp:posOffset>3012509</wp:posOffset>
-            </wp:positionH>
-            <wp:positionV relativeFrom="paragraph">
-              <wp:posOffset>3175347</wp:posOffset>
-            </wp:positionV>
-            <wp:extent cx="1" cy="569934"/>
-            <wp:effectExtent l="0" t="0" r="0" b="0"/>
-            <wp:wrapNone/>
-            <wp:docPr id="11" name="edge-n3-n4"/>
-            <wp:cNvGraphicFramePr/>
-            <a:graphic>
-              <a:graphicData uri="http://schemas.microsoft.com/office/word/2010/wordprocessingShape">
-                <wps:wsp>
-                  <wps:cNvCnPr/>
-                  <wps:spPr>
-                    <a:xfrm>
-                      <a:off x="0" y="0"/>
-                      <a:ext cx="1" cy="569934"/>
-                    </a:xfrm>
-                    <a:prstGeom prst="line">
-                      <a:avLst/>
-                    </a:prstGeom>
-                    <a:ln w="19050">
-                      <a:solidFill>
-                        <a:srgbClr val="000000"/>
-                      </a:solidFill>
-                      <a:tailEnd type="triangle"/>
-                    </a:ln>
-                  </wps:spPr>
-                  <wps:bodyPr/>
-                </wps:wsp>
-              </a:graphicData>
-            </a:graphic>
-          </wp:anchor>
-        </w:drawing>
-      </w:r>
-      <w:r>
-        <w:drawing>
-          <wp:anchor distT="0" distB="0" distL="0" distR="0" simplePos="0" relativeHeight="262" behindDoc="0" locked="0" layoutInCell="1" allowOverlap="1">
-            <wp:simplePos x="0" y="0"/>
-            <wp:positionH relativeFrom="paragraph">
-              <wp:posOffset>1058449</wp:posOffset>
-            </wp:positionH>
-            <wp:positionV relativeFrom="paragraph">
-              <wp:posOffset>4111668</wp:posOffset>
-            </wp:positionV>
-            <wp:extent cx="1221287" cy="936320"/>
-            <wp:effectExtent l="0" t="0" r="0" b="0"/>
-            <wp:wrapNone/>
-            <wp:docPr id="12" name="edge-n4-n5"/>
-            <wp:cNvGraphicFramePr/>
-            <a:graphic>
-              <a:graphicData uri="http://schemas.microsoft.com/office/word/2010/wordprocessingShape">
-                <wps:wsp>
-                  <wps:cNvCnPr/>
-                  <wps:spPr>
-                    <a:xfrm flipH="1">
-                      <a:off x="0" y="0"/>
-                      <a:ext cx="1221287" cy="936320"/>
-                    </a:xfrm>
-                    <a:prstGeom prst="bentConnector2">
-                      <a:avLst/>
-                    </a:prstGeom>
-                    <a:ln w="19050">
-                      <a:solidFill>
-                        <a:srgbClr val="000000"/>
-                      </a:solidFill>
-                      <a:tailEnd type="triangle"/>
-                    </a:ln>
-                  </wps:spPr>
-                  <wps:bodyPr/>
-                </wps:wsp>
-              </a:graphicData>
-            </a:graphic>
-          </wp:anchor>
-        </w:drawing>
-      </w:r>
-      <w:r>
-        <w:drawing>
-          <wp:anchor distT="0" distB="0" distL="0" distR="0" simplePos="0" relativeHeight="263" behindDoc="0" locked="0" layoutInCell="1" allowOverlap="1">
-            <wp:simplePos x="0" y="0"/>
-            <wp:positionH relativeFrom="paragraph">
-              <wp:posOffset>2035479</wp:posOffset>
-            </wp:positionH>
-            <wp:positionV relativeFrom="paragraph">
-              <wp:posOffset>3916262</wp:posOffset>
-            </wp:positionV>
-            <wp:extent cx="488515" cy="179122"/>
-            <wp:effectExtent l="0" t="0" r="0" b="0"/>
-            <wp:wrapNone/>
-            <wp:docPr id="13" name="label-n4-n5"/>
-            <wp:cNvGraphicFramePr/>
-            <a:graphic>
-              <a:graphicData uri="http://schemas.microsoft.com/office/word/2010/wordprocessingShape">
-                <wps:wsp>
-                  <wps:cNvSpPr/>
-                  <wps:spPr>
-                    <a:xfrm>
-                      <a:off x="0" y="0"/>
-                      <a:ext cx="1" cy="1"/>
-                    </a:xfrm>
-                    <a:prstGeom prst="rect">
-                      <a:avLst/>
-                    </a:prstGeom>
-                    <a:noFill/>
-                    <a:ln>
+                      <a:ln w="19050">
+                        <a:solidFill>
+                          <a:srgbClr val="000000"/>
+                        </a:solidFill>
+                      </a:ln>
+                    </wps:spPr>
+                    <wps:txbx>
+                      <w:txbxContent>
+                        <w:p>
+                          <w:pPr>
+                            <w:spacing w:after="0"/>
+                            <w:jc w:val="center"/>
+                          </w:pPr>
+                          <w:r>
+                            <w:rPr>
+                              <w:sz w:val="18"/>
+                              <w:szCs w:val="18"/>
+                            </w:rPr>
+                            <w:t xml:space="preserve">a = a + 16</w:t>
+                          </w:r>
+                        </w:p>
+                      </w:txbxContent>
+                    </wps:txbx>
+                    <wps:bodyPr rot="0" vert="horz" lIns="18000" tIns="18000" rIns="18000" bIns="18000" anchor="ctr" anchorCtr="0">
+                      <a:noAutofit/>
+                    </wps:bodyPr>
+                  </wps:wsp>
+                  <wps:wsp>
+                    <wps:cNvPr id="10" name="edge-n1-n2"/>
+                    <wps:cNvCnPr>
+                      <a:stCxn id="2" idx="2"/>
+                      <a:endCxn id="3" idx="0"/>
+                    </wps:cNvCnPr>
+                    <wps:spPr>
+                      <a:xfrm>
+                        <a:off x="2893594" y="860257"/>
+                        <a:ext cx="1" cy="703847"/>
+                      </a:xfrm>
+                      <a:prstGeom prst="line">
+                        <a:avLst/>
+                      </a:prstGeom>
+                      <a:ln w="19050">
+                        <a:solidFill>
+                          <a:srgbClr val="000000"/>
+                        </a:solidFill>
+                        <a:tailEnd type="triangle"/>
+                      </a:ln>
+                    </wps:spPr>
+                    <wps:bodyPr/>
+                  </wps:wsp>
+                  <wps:wsp>
+                    <wps:cNvPr id="11" name="edge-n2-n3"/>
+                    <wps:cNvCnPr>
+                      <a:stCxn id="3" idx="2"/>
+                      <a:endCxn id="4" idx="0"/>
+                    </wps:cNvCnPr>
+                    <wps:spPr>
+                      <a:xfrm>
+                        <a:off x="2893594" y="1955131"/>
+                        <a:ext cx="1" cy="703847"/>
+                      </a:xfrm>
+                      <a:prstGeom prst="line">
+                        <a:avLst/>
+                      </a:prstGeom>
+                      <a:ln w="19050">
+                        <a:solidFill>
+                          <a:srgbClr val="000000"/>
+                        </a:solidFill>
+                        <a:tailEnd type="triangle"/>
+                      </a:ln>
+                    </wps:spPr>
+                    <wps:bodyPr/>
+                  </wps:wsp>
+                  <wps:wsp>
+                    <wps:cNvPr id="12" name="edge-n3-n4"/>
+                    <wps:cNvCnPr>
+                      <a:stCxn id="4" idx="2"/>
+                      <a:endCxn id="5" idx="0"/>
+                    </wps:cNvCnPr>
+                    <wps:spPr>
+                      <a:xfrm>
+                        <a:off x="2893594" y="3050005"/>
+                        <a:ext cx="1" cy="547436"/>
+                      </a:xfrm>
+                      <a:prstGeom prst="line">
+                        <a:avLst/>
+                      </a:prstGeom>
+                      <a:ln w="19050">
+                        <a:solidFill>
+                          <a:srgbClr val="000000"/>
+                        </a:solidFill>
+                        <a:tailEnd type="triangle"/>
+                      </a:ln>
+                    </wps:spPr>
+                    <wps:bodyPr/>
+                  </wps:wsp>
+                  <wps:wsp>
+                    <wps:cNvPr id="13" name="edge-n4-n5"/>
+                    <wps:cNvCnPr>
+                      <a:stCxn id="5" idx="1"/>
+                      <a:endCxn id="6" idx="0"/>
+                    </wps:cNvCnPr>
+                    <wps:spPr>
+                      <a:xfrm flipH="1">
+                        <a:off x="1016668" y="3949365"/>
+                        <a:ext cx="1173078" cy="899360"/>
+                      </a:xfrm>
+                      <a:prstGeom prst="bentConnector2">
+                        <a:avLst/>
+                      </a:prstGeom>
+                      <a:ln w="19050">
+                        <a:solidFill>
+                          <a:srgbClr val="000000"/>
+                        </a:solidFill>
+                        <a:tailEnd type="triangle"/>
+                      </a:ln>
+                    </wps:spPr>
+                    <wps:bodyPr/>
+                  </wps:wsp>
+                  <wps:wsp>
+                    <wps:cNvPr id="14" name="label-14"/>
+                    <wps:cNvSpPr/>
+                    <wps:spPr>
+                      <a:xfrm>
+                        <a:off x="1955131" y="3761673"/>
+                        <a:ext cx="469231" cy="172051"/>
+                      </a:xfrm>
+                      <a:prstGeom prst="rect">
+                        <a:avLst/>
+                      </a:prstGeom>
                       <a:noFill/>
-                    </a:ln>
-                  </wps:spPr>
-                  <wps:txbx>
-                    <w:txbxContent>
-                      <w:p>
-                        <w:pPr>
-                          <w:spacing w:after="0"/>
-                        </w:pPr>
-                        <w:r>
-                          <w:rPr>
-                            <w:i/>
-                            <w:sz w:val="18"/>
-                            <w:szCs w:val="18"/>
-                          </w:rPr>
-                          <w:t xml:space="preserve">Yox</w:t>
-                        </w:r>
-                      </w:p>
-                    </w:txbxContent>
-                  </wps:txbx>
-                  <wps:bodyPr lIns="0" tIns="0" rIns="0" bIns="0" anchor="t">
-                    <a:noAutofit/>
-                  </wps:bodyPr>
-                </wps:wsp>
-              </a:graphicData>
-            </a:graphic>
-          </wp:anchor>
-        </w:drawing>
-      </w:r>
-      <w:r>
-        <w:drawing>
-          <wp:anchor distT="0" distB="0" distL="0" distR="0" simplePos="0" relativeHeight="264" behindDoc="0" locked="0" layoutInCell="1" allowOverlap="1">
-            <wp:simplePos x="0" y="0"/>
-            <wp:positionH relativeFrom="paragraph">
-              <wp:posOffset>1058449</wp:posOffset>
-            </wp:positionH>
-            <wp:positionV relativeFrom="paragraph">
-              <wp:posOffset>5455084</wp:posOffset>
-            </wp:positionV>
-            <wp:extent cx="1" cy="732772"/>
-            <wp:effectExtent l="0" t="0" r="0" b="0"/>
-            <wp:wrapNone/>
-            <wp:docPr id="14" name="edge-n5-n6"/>
-            <wp:cNvGraphicFramePr/>
-            <a:graphic>
-              <a:graphicData uri="http://schemas.microsoft.com/office/word/2010/wordprocessingShape">
-                <wps:wsp>
-                  <wps:cNvCnPr/>
-                  <wps:spPr>
-                    <a:xfrm>
-                      <a:off x="0" y="0"/>
-                      <a:ext cx="1" cy="732772"/>
-                    </a:xfrm>
-                    <a:prstGeom prst="line">
-                      <a:avLst/>
-                    </a:prstGeom>
-                    <a:ln w="19050">
-                      <a:solidFill>
-                        <a:srgbClr val="000000"/>
-                      </a:solidFill>
-                      <a:tailEnd type="triangle"/>
-                    </a:ln>
-                  </wps:spPr>
-                  <wps:bodyPr/>
-                </wps:wsp>
-              </a:graphicData>
-            </a:graphic>
-          </wp:anchor>
-        </w:drawing>
-      </w:r>
-      <w:r>
-        <w:drawing>
-          <wp:anchor distT="0" distB="0" distL="0" distR="0" simplePos="0" relativeHeight="265" behindDoc="0" locked="0" layoutInCell="1" allowOverlap="1">
-            <wp:simplePos x="0" y="0"/>
-            <wp:positionH relativeFrom="paragraph">
-              <wp:posOffset>3745282</wp:posOffset>
-            </wp:positionH>
-            <wp:positionV relativeFrom="paragraph">
-              <wp:posOffset>4111668</wp:posOffset>
-            </wp:positionV>
-            <wp:extent cx="1221287" cy="936320"/>
-            <wp:effectExtent l="0" t="0" r="0" b="0"/>
-            <wp:wrapNone/>
-            <wp:docPr id="15" name="edge-n4-n7"/>
-            <wp:cNvGraphicFramePr/>
-            <a:graphic>
-              <a:graphicData uri="http://schemas.microsoft.com/office/word/2010/wordprocessingShape">
-                <wps:wsp>
-                  <wps:cNvCnPr/>
-                  <wps:spPr>
-                    <a:xfrm>
-                      <a:off x="0" y="0"/>
-                      <a:ext cx="1221287" cy="936320"/>
-                    </a:xfrm>
-                    <a:prstGeom prst="bentConnector2">
-                      <a:avLst/>
-                    </a:prstGeom>
-                    <a:ln w="19050">
-                      <a:solidFill>
-                        <a:srgbClr val="000000"/>
-                      </a:solidFill>
-                      <a:tailEnd type="triangle"/>
-                    </a:ln>
-                  </wps:spPr>
-                  <wps:bodyPr/>
-                </wps:wsp>
-              </a:graphicData>
-            </a:graphic>
-          </wp:anchor>
-        </w:drawing>
-      </w:r>
-      <w:r>
-        <w:drawing>
-          <wp:anchor distT="0" distB="0" distL="0" distR="0" simplePos="0" relativeHeight="266" behindDoc="0" locked="0" layoutInCell="1" allowOverlap="1">
-            <wp:simplePos x="0" y="0"/>
-            <wp:positionH relativeFrom="paragraph">
-              <wp:posOffset>3989539</wp:posOffset>
-            </wp:positionH>
-            <wp:positionV relativeFrom="paragraph">
-              <wp:posOffset>3916262</wp:posOffset>
-            </wp:positionV>
-            <wp:extent cx="488515" cy="179122"/>
-            <wp:effectExtent l="0" t="0" r="0" b="0"/>
-            <wp:wrapNone/>
-            <wp:docPr id="16" name="label-n4-n7"/>
-            <wp:cNvGraphicFramePr/>
-            <a:graphic>
-              <a:graphicData uri="http://schemas.microsoft.com/office/word/2010/wordprocessingShape">
-                <wps:wsp>
-                  <wps:cNvSpPr/>
-                  <wps:spPr>
-                    <a:xfrm>
-                      <a:off x="0" y="0"/>
-                      <a:ext cx="1" cy="1"/>
-                    </a:xfrm>
-                    <a:prstGeom prst="rect">
-                      <a:avLst/>
-                    </a:prstGeom>
-                    <a:noFill/>
-                    <a:ln>
+                      <a:ln>
+                        <a:noFill/>
+                      </a:ln>
+                    </wps:spPr>
+                    <wps:txbx>
+                      <w:txbxContent>
+                        <w:p>
+                          <w:pPr>
+                            <w:spacing w:after="0"/>
+                          </w:pPr>
+                          <w:r>
+                            <w:rPr>
+                              <w:i/>
+                              <w:sz w:val="16"/>
+                              <w:szCs w:val="16"/>
+                            </w:rPr>
+                            <w:t xml:space="preserve">Yox</w:t>
+                          </w:r>
+                        </w:p>
+                      </w:txbxContent>
+                    </wps:txbx>
+                    <wps:bodyPr lIns="0" tIns="0" rIns="0" bIns="0" anchor="t">
+                      <a:noAutofit/>
+                    </wps:bodyPr>
+                  </wps:wsp>
+                  <wps:wsp>
+                    <wps:cNvPr id="15" name="edge-n5-n6"/>
+                    <wps:cNvCnPr>
+                      <a:stCxn id="6" idx="2"/>
+                      <a:endCxn id="7" idx="0"/>
+                    </wps:cNvCnPr>
+                    <wps:spPr>
+                      <a:xfrm>
+                        <a:off x="1016668" y="5239752"/>
+                        <a:ext cx="1" cy="703847"/>
+                      </a:xfrm>
+                      <a:prstGeom prst="line">
+                        <a:avLst/>
+                      </a:prstGeom>
+                      <a:ln w="19050">
+                        <a:solidFill>
+                          <a:srgbClr val="000000"/>
+                        </a:solidFill>
+                        <a:tailEnd type="triangle"/>
+                      </a:ln>
+                    </wps:spPr>
+                    <wps:bodyPr/>
+                  </wps:wsp>
+                  <wps:wsp>
+                    <wps:cNvPr id="16" name="edge-n4-n7"/>
+                    <wps:cNvCnPr>
+                      <a:stCxn id="5" idx="3"/>
+                      <a:endCxn id="8" idx="0"/>
+                    </wps:cNvCnPr>
+                    <wps:spPr>
+                      <a:xfrm>
+                        <a:off x="3597442" y="3949365"/>
+                        <a:ext cx="1173078" cy="899360"/>
+                      </a:xfrm>
+                      <a:prstGeom prst="bentConnector2">
+                        <a:avLst/>
+                      </a:prstGeom>
+                      <a:ln w="19050">
+                        <a:solidFill>
+                          <a:srgbClr val="000000"/>
+                        </a:solidFill>
+                        <a:tailEnd type="triangle"/>
+                      </a:ln>
+                    </wps:spPr>
+                    <wps:bodyPr/>
+                  </wps:wsp>
+                  <wps:wsp>
+                    <wps:cNvPr id="17" name="label-17"/>
+                    <wps:cNvSpPr/>
+                    <wps:spPr>
+                      <a:xfrm>
+                        <a:off x="3832057" y="3761673"/>
+                        <a:ext cx="469231" cy="172051"/>
+                      </a:xfrm>
+                      <a:prstGeom prst="rect">
+                        <a:avLst/>
+                      </a:prstGeom>
                       <a:noFill/>
-                    </a:ln>
-                  </wps:spPr>
-                  <wps:txbx>
-                    <w:txbxContent>
-                      <w:p>
-                        <w:pPr>
-                          <w:spacing w:after="0"/>
-                        </w:pPr>
-                        <w:r>
-                          <w:rPr>
-                            <w:i/>
-                            <w:sz w:val="18"/>
-                            <w:szCs w:val="18"/>
-                          </w:rPr>
-                          <w:t xml:space="preserve">Hə</w:t>
-                        </w:r>
-                      </w:p>
-                    </w:txbxContent>
-                  </wps:txbx>
-                  <wps:bodyPr lIns="0" tIns="0" rIns="0" bIns="0" anchor="t">
-                    <a:noAutofit/>
-                  </wps:bodyPr>
-                </wps:wsp>
-              </a:graphicData>
-            </a:graphic>
-          </wp:anchor>
-        </w:drawing>
-      </w:r>
-      <w:r>
-        <w:drawing>
-          <wp:anchor distT="0" distB="0" distL="0" distR="0" simplePos="0" relativeHeight="267" behindDoc="0" locked="0" layoutInCell="1" allowOverlap="1">
-            <wp:simplePos x="0" y="0"/>
-            <wp:positionH relativeFrom="paragraph">
-              <wp:posOffset>4966569</wp:posOffset>
-            </wp:positionH>
-            <wp:positionV relativeFrom="paragraph">
-              <wp:posOffset>5455084</wp:posOffset>
-            </wp:positionV>
-            <wp:extent cx="1" cy="732772"/>
-            <wp:effectExtent l="0" t="0" r="0" b="0"/>
-            <wp:wrapNone/>
-            <wp:docPr id="17" name="edge-n7-n8"/>
-            <wp:cNvGraphicFramePr/>
-            <a:graphic>
-              <a:graphicData uri="http://schemas.microsoft.com/office/word/2010/wordprocessingShape">
-                <wps:wsp>
-                  <wps:cNvCnPr/>
-                  <wps:spPr>
-                    <a:xfrm>
-                      <a:off x="0" y="0"/>
-                      <a:ext cx="1" cy="732772"/>
-                    </a:xfrm>
-                    <a:prstGeom prst="line">
-                      <a:avLst/>
-                    </a:prstGeom>
-                    <a:ln w="19050">
-                      <a:solidFill>
-                        <a:srgbClr val="000000"/>
-                      </a:solidFill>
-                      <a:tailEnd type="triangle"/>
-                    </a:ln>
-                  </wps:spPr>
-                  <wps:bodyPr/>
-                </wps:wsp>
-              </a:graphicData>
-            </a:graphic>
-          </wp:anchor>
-        </w:drawing>
-      </w:r>
-      <w:r>
-        <w:drawing>
-          <wp:anchor distT="0" distB="0" distL="0" distR="0" simplePos="0" relativeHeight="268" behindDoc="0" locked="0" layoutInCell="1" allowOverlap="1">
-            <wp:simplePos x="0" y="0"/>
-            <wp:positionH relativeFrom="paragraph">
-              <wp:posOffset>5617923</wp:posOffset>
-            </wp:positionH>
-            <wp:positionV relativeFrom="paragraph">
-              <wp:posOffset>6391405</wp:posOffset>
-            </wp:positionV>
-            <wp:extent cx="407095" cy="1"/>
-            <wp:effectExtent l="0" t="0" r="0" b="0"/>
-            <wp:wrapNone/>
-            <wp:docPr id="18" name="backedge-n8-n4-0"/>
-            <wp:cNvGraphicFramePr/>
-            <a:graphic>
-              <a:graphicData uri="http://schemas.microsoft.com/office/word/2010/wordprocessingShape">
-                <wps:wsp>
-                  <wps:cNvCnPr/>
-                  <wps:spPr>
-                    <a:xfrm>
-                      <a:off x="0" y="0"/>
-                      <a:ext cx="407095" cy="1"/>
-                    </a:xfrm>
-                    <a:prstGeom prst="line">
-                      <a:avLst/>
-                    </a:prstGeom>
-                    <a:ln w="19050">
-                      <a:solidFill>
-                        <a:srgbClr val="000000"/>
-                      </a:solidFill>
-                    </a:ln>
-                  </wps:spPr>
-                  <wps:bodyPr/>
-                </wps:wsp>
-              </a:graphicData>
-            </a:graphic>
-          </wp:anchor>
-        </w:drawing>
-      </w:r>
-      <w:r>
-        <w:drawing>
-          <wp:anchor distT="0" distB="0" distL="0" distR="0" simplePos="0" relativeHeight="269" behindDoc="0" locked="0" layoutInCell="1" allowOverlap="1">
-            <wp:simplePos x="0" y="0"/>
-            <wp:positionH relativeFrom="paragraph">
-              <wp:posOffset>6025019</wp:posOffset>
-            </wp:positionH>
-            <wp:positionV relativeFrom="paragraph">
-              <wp:posOffset>4111668</wp:posOffset>
-            </wp:positionV>
-            <wp:extent cx="1" cy="2279736"/>
-            <wp:effectExtent l="0" t="0" r="0" b="0"/>
-            <wp:wrapNone/>
-            <wp:docPr id="19" name="backedge-n8-n4-1"/>
-            <wp:cNvGraphicFramePr/>
-            <a:graphic>
-              <a:graphicData uri="http://schemas.microsoft.com/office/word/2010/wordprocessingShape">
-                <wps:wsp>
-                  <wps:cNvCnPr/>
-                  <wps:spPr>
-                    <a:xfrm flipV="1">
-                      <a:off x="0" y="0"/>
-                      <a:ext cx="1" cy="2279736"/>
-                    </a:xfrm>
-                    <a:prstGeom prst="line">
-                      <a:avLst/>
-                    </a:prstGeom>
-                    <a:ln w="19050">
-                      <a:solidFill>
-                        <a:srgbClr val="000000"/>
-                      </a:solidFill>
-                    </a:ln>
-                  </wps:spPr>
-                  <wps:bodyPr/>
-                </wps:wsp>
-              </a:graphicData>
-            </a:graphic>
-          </wp:anchor>
-        </w:drawing>
-      </w:r>
-      <w:r>
-        <w:drawing>
-          <wp:anchor distT="0" distB="0" distL="0" distR="0" simplePos="0" relativeHeight="270" behindDoc="0" locked="0" layoutInCell="1" allowOverlap="1">
-            <wp:simplePos x="0" y="0"/>
-            <wp:positionH relativeFrom="paragraph">
-              <wp:posOffset>3745282</wp:posOffset>
-            </wp:positionH>
-            <wp:positionV relativeFrom="paragraph">
-              <wp:posOffset>4111668</wp:posOffset>
-            </wp:positionV>
-            <wp:extent cx="2279736" cy="1"/>
-            <wp:effectExtent l="0" t="0" r="0" b="0"/>
-            <wp:wrapNone/>
-            <wp:docPr id="20" name="backedge-n8-n4-2"/>
-            <wp:cNvGraphicFramePr/>
-            <a:graphic>
-              <a:graphicData uri="http://schemas.microsoft.com/office/word/2010/wordprocessingShape">
-                <wps:wsp>
-                  <wps:cNvCnPr/>
-                  <wps:spPr>
-                    <a:xfrm flipH="1">
-                      <a:off x="0" y="0"/>
-                      <a:ext cx="2279736" cy="1"/>
-                    </a:xfrm>
-                    <a:prstGeom prst="line">
-                      <a:avLst/>
-                    </a:prstGeom>
-                    <a:ln w="19050">
-                      <a:solidFill>
-                        <a:srgbClr val="000000"/>
-                      </a:solidFill>
-                      <a:tailEnd type="triangle"/>
-                    </a:ln>
-                  </wps:spPr>
-                  <wps:bodyPr/>
-                </wps:wsp>
+                      <a:ln>
+                        <a:noFill/>
+                      </a:ln>
+                    </wps:spPr>
+                    <wps:txbx>
+                      <w:txbxContent>
+                        <w:p>
+                          <w:pPr>
+                            <w:spacing w:after="0"/>
+                          </w:pPr>
+                          <w:r>
+                            <w:rPr>
+                              <w:i/>
+                              <w:sz w:val="16"/>
+                              <w:szCs w:val="16"/>
+                            </w:rPr>
+                            <w:t xml:space="preserve">Hə</w:t>
+                          </w:r>
+                        </w:p>
+                      </w:txbxContent>
+                    </wps:txbx>
+                    <wps:bodyPr lIns="0" tIns="0" rIns="0" bIns="0" anchor="t">
+                      <a:noAutofit/>
+                    </wps:bodyPr>
+                  </wps:wsp>
+                  <wps:wsp>
+                    <wps:cNvPr id="18" name="edge-n7-n8"/>
+                    <wps:cNvCnPr>
+                      <a:stCxn id="8" idx="2"/>
+                      <a:endCxn id="9" idx="0"/>
+                    </wps:cNvCnPr>
+                    <wps:spPr>
+                      <a:xfrm>
+                        <a:off x="4770521" y="5239752"/>
+                        <a:ext cx="1" cy="703847"/>
+                      </a:xfrm>
+                      <a:prstGeom prst="line">
+                        <a:avLst/>
+                      </a:prstGeom>
+                      <a:ln w="19050">
+                        <a:solidFill>
+                          <a:srgbClr val="000000"/>
+                        </a:solidFill>
+                        <a:tailEnd type="triangle"/>
+                      </a:ln>
+                    </wps:spPr>
+                    <wps:bodyPr/>
+                  </wps:wsp>
+                  <wps:wsp>
+                    <wps:cNvPr id="19" name="backedge-n8-n4-0"/>
+                    <wps:cNvCnPr>
+                      <a:stCxn id="9" idx="3"/>
+                    </wps:cNvCnPr>
+                    <wps:spPr>
+                      <a:xfrm>
+                        <a:off x="5396163" y="6139113"/>
+                        <a:ext cx="391026" cy="1"/>
+                      </a:xfrm>
+                      <a:prstGeom prst="line">
+                        <a:avLst/>
+                      </a:prstGeom>
+                      <a:ln w="19050">
+                        <a:solidFill>
+                          <a:srgbClr val="000000"/>
+                        </a:solidFill>
+                      </a:ln>
+                    </wps:spPr>
+                    <wps:bodyPr/>
+                  </wps:wsp>
+                  <wps:wsp>
+                    <wps:cNvPr id="20" name="backedge-n8-n4-1"/>
+                    <wps:cNvCnPr/>
+                    <wps:spPr>
+                      <a:xfrm flipV="1">
+                        <a:off x="5787189" y="3949365"/>
+                        <a:ext cx="1" cy="2189747"/>
+                      </a:xfrm>
+                      <a:prstGeom prst="line">
+                        <a:avLst/>
+                      </a:prstGeom>
+                      <a:ln w="19050">
+                        <a:solidFill>
+                          <a:srgbClr val="000000"/>
+                        </a:solidFill>
+                      </a:ln>
+                    </wps:spPr>
+                    <wps:bodyPr/>
+                  </wps:wsp>
+                  <wps:wsp>
+                    <wps:cNvPr id="21" name="backedge-n8-n4-2"/>
+                    <wps:cNvCnPr>
+                      <a:endCxn id="5" idx="3"/>
+                    </wps:cNvCnPr>
+                    <wps:spPr>
+                      <a:xfrm flipH="1">
+                        <a:off x="3597442" y="3949365"/>
+                        <a:ext cx="2189747" cy="1"/>
+                      </a:xfrm>
+                      <a:prstGeom prst="line">
+                        <a:avLst/>
+                      </a:prstGeom>
+                      <a:ln w="19050">
+                        <a:solidFill>
+                          <a:srgbClr val="000000"/>
+                        </a:solidFill>
+                        <a:tailEnd type="triangle"/>
+                      </a:ln>
+                    </wps:spPr>
+                    <wps:bodyPr/>
+                  </wps:wsp>
+                </wpc:wpc>
               </a:graphicData>
             </a:graphic>
           </wp:anchor>

</xml_diff>

<commit_message>
Make back-edge a single fully-attached bent connector (PPTX + DOCX)
The rail was 3 stitched straight segments with fixed waypoint
coordinates; only the outer ends were attached, so dragging a shape
left the middle of the loop floating in both PowerPoint and Word.

Replace with ONE bentConnector3 per back-edge, attached at both ends
(begin/end_connect in pptx, stCxn/endCxn in docx, right side idx 3),
with an explicit adj1 adjustment expressing the vertical rail as a
ratio of the horizontal span between the connection points (negative =
outside the bbox, right of the source). Office recomputes the whole
bent path from live shape positions on drag. adj computation shared
via pptx_shapes.back_edge_rail_adj(); stitched-segment code removed.

Tests assert the back-edge is a single shape with both ends attached
in both formats; 51 passing.

Co-Authored-By: Claude Fable 5 <noreply@anthropic.com>
</commit_message>
<xml_diff>
--- a/samples/output/flowchart_diagram.docx
+++ b/samples/output/flowchart_diagram.docx
@@ -585,57 +585,20 @@
                     <wps:bodyPr/>
                   </wps:wsp>
                   <wps:wsp>
-                    <wps:cNvPr id="19" name="backedge-n8-n4-0"/>
+                    <wps:cNvPr id="19" name="backedge-n8-n4"/>
                     <wps:cNvCnPr>
                       <a:stCxn id="9" idx="3"/>
-                    </wps:cNvCnPr>
-                    <wps:spPr>
-                      <a:xfrm>
-                        <a:off x="5396163" y="6139113"/>
-                        <a:ext cx="391026" cy="1"/>
-                      </a:xfrm>
-                      <a:prstGeom prst="line">
-                        <a:avLst/>
-                      </a:prstGeom>
-                      <a:ln w="19050">
-                        <a:solidFill>
-                          <a:srgbClr val="000000"/>
-                        </a:solidFill>
-                      </a:ln>
-                    </wps:spPr>
-                    <wps:bodyPr/>
-                  </wps:wsp>
-                  <wps:wsp>
-                    <wps:cNvPr id="20" name="backedge-n8-n4-1"/>
-                    <wps:cNvCnPr/>
-                    <wps:spPr>
-                      <a:xfrm flipV="1">
-                        <a:off x="5787189" y="3949365"/>
-                        <a:ext cx="1" cy="2189747"/>
-                      </a:xfrm>
-                      <a:prstGeom prst="line">
-                        <a:avLst/>
-                      </a:prstGeom>
-                      <a:ln w="19050">
-                        <a:solidFill>
-                          <a:srgbClr val="000000"/>
-                        </a:solidFill>
-                      </a:ln>
-                    </wps:spPr>
-                    <wps:bodyPr/>
-                  </wps:wsp>
-                  <wps:wsp>
-                    <wps:cNvPr id="21" name="backedge-n8-n4-2"/>
-                    <wps:cNvCnPr>
                       <a:endCxn id="5" idx="3"/>
                     </wps:cNvCnPr>
                     <wps:spPr>
-                      <a:xfrm flipH="1">
+                      <a:xfrm flipH="1" flipV="1">
                         <a:off x="3597442" y="3949365"/>
-                        <a:ext cx="2189747" cy="1"/>
+                        <a:ext cx="1798721" cy="2189747"/>
                       </a:xfrm>
-                      <a:prstGeom prst="line">
-                        <a:avLst/>
+                      <a:prstGeom prst="bentConnector3">
+                        <a:avLst>
+                          <a:gd name="adj1" fmla="val -21739"/>
+                        </a:avLst>
                       </a:prstGeom>
                       <a:ln w="19050">
                         <a:solidFill>

</xml_diff>